<commit_message>
Stile: Risikoband mit Magenta, swissTLM3D-Wanderwege mit Wegzeichen
- absturzrisiko_band.qml: 2 hellorange, 3 rot, 4 magenta
- neu: swisstlm3d_wanderwege_signalisation.qml mit Wegzeichen auf der Linie
- README und Dokumentation angepasst, Beispielbild Brüggler

Co-Authored-By: Claude Opus 5.5 <noreply@anthropic.com>
Claude-Session: https://claude.ai/code/session_01A2b2SUgV9TwSXYezuK3EEY
</commit_message>
<xml_diff>
--- a/docs/fall_exposure_qgis_dokumentation.docx
+++ b/docs/fall_exposure_qgis_dokumentation.docx
@@ -137,7 +137,7 @@
             </w:rPr>
             <w:fldChar w:fldCharType="separate"/>
           </w:r>
-          <w:hyperlink w:anchor="__RefHeading___Toc1150_50781890">
+          <w:hyperlink w:anchor="__RefHeading___Toc1160_784777474">
             <w:r>
               <w:rPr>
                 <w:rStyle w:val="IndexLink"/>
@@ -157,7 +157,7 @@
             </w:tabs>
             <w:rPr/>
           </w:pPr>
-          <w:hyperlink w:anchor="__RefHeading___Toc1152_50781890">
+          <w:hyperlink w:anchor="__RefHeading___Toc1162_784777474">
             <w:r>
               <w:rPr>
                 <w:rStyle w:val="IndexLink"/>
@@ -177,7 +177,7 @@
             </w:tabs>
             <w:rPr/>
           </w:pPr>
-          <w:hyperlink w:anchor="__RefHeading___Toc1154_50781890">
+          <w:hyperlink w:anchor="__RefHeading___Toc1164_784777474">
             <w:r>
               <w:rPr>
                 <w:rStyle w:val="IndexLink"/>
@@ -197,7 +197,7 @@
             </w:tabs>
             <w:rPr/>
           </w:pPr>
-          <w:hyperlink w:anchor="__RefHeading___Toc1156_50781890">
+          <w:hyperlink w:anchor="__RefHeading___Toc1166_784777474">
             <w:r>
               <w:rPr>
                 <w:rStyle w:val="IndexLink"/>
@@ -217,7 +217,7 @@
             </w:tabs>
             <w:rPr/>
           </w:pPr>
-          <w:hyperlink w:anchor="__RefHeading___Toc1158_50781890">
+          <w:hyperlink w:anchor="__RefHeading___Toc1168_784777474">
             <w:r>
               <w:rPr>
                 <w:rStyle w:val="IndexLink"/>
@@ -237,7 +237,7 @@
             </w:tabs>
             <w:rPr/>
           </w:pPr>
-          <w:hyperlink w:anchor="__RefHeading___Toc1160_50781890">
+          <w:hyperlink w:anchor="__RefHeading___Toc1170_784777474">
             <w:r>
               <w:rPr>
                 <w:rStyle w:val="IndexLink"/>
@@ -257,7 +257,7 @@
             </w:tabs>
             <w:rPr/>
           </w:pPr>
-          <w:hyperlink w:anchor="__RefHeading___Toc1162_50781890">
+          <w:hyperlink w:anchor="__RefHeading___Toc1172_784777474">
             <w:r>
               <w:rPr>
                 <w:rStyle w:val="IndexLink"/>
@@ -277,7 +277,7 @@
             </w:tabs>
             <w:rPr/>
           </w:pPr>
-          <w:hyperlink w:anchor="__RefHeading___Toc1164_50781890">
+          <w:hyperlink w:anchor="__RefHeading___Toc1174_784777474">
             <w:r>
               <w:rPr>
                 <w:rStyle w:val="IndexLink"/>
@@ -297,7 +297,7 @@
             </w:tabs>
             <w:rPr/>
           </w:pPr>
-          <w:hyperlink w:anchor="__RefHeading___Toc1166_50781890">
+          <w:hyperlink w:anchor="__RefHeading___Toc1176_784777474">
             <w:r>
               <w:rPr>
                 <w:rStyle w:val="IndexLink"/>
@@ -317,7 +317,7 @@
             </w:tabs>
             <w:rPr/>
           </w:pPr>
-          <w:hyperlink w:anchor="__RefHeading___Toc1168_50781890">
+          <w:hyperlink w:anchor="__RefHeading___Toc1178_784777474">
             <w:r>
               <w:rPr>
                 <w:rStyle w:val="IndexLink"/>
@@ -337,7 +337,7 @@
             </w:tabs>
             <w:rPr/>
           </w:pPr>
-          <w:hyperlink w:anchor="__RefHeading___Toc1170_50781890">
+          <w:hyperlink w:anchor="__RefHeading___Toc1180_784777474">
             <w:r>
               <w:rPr>
                 <w:rStyle w:val="IndexLink"/>
@@ -357,7 +357,7 @@
             </w:tabs>
             <w:rPr/>
           </w:pPr>
-          <w:hyperlink w:anchor="__RefHeading___Toc1172_50781890">
+          <w:hyperlink w:anchor="__RefHeading___Toc1182_784777474">
             <w:r>
               <w:rPr>
                 <w:rStyle w:val="IndexLink"/>
@@ -377,7 +377,7 @@
             </w:tabs>
             <w:rPr/>
           </w:pPr>
-          <w:hyperlink w:anchor="__RefHeading___Toc1174_50781890">
+          <w:hyperlink w:anchor="__RefHeading___Toc1184_784777474">
             <w:r>
               <w:rPr>
                 <w:rStyle w:val="IndexLink"/>
@@ -397,7 +397,7 @@
             </w:tabs>
             <w:rPr/>
           </w:pPr>
-          <w:hyperlink w:anchor="__RefHeading___Toc1176_50781890">
+          <w:hyperlink w:anchor="__RefHeading___Toc1186_784777474">
             <w:r>
               <w:rPr>
                 <w:rStyle w:val="IndexLink"/>
@@ -417,7 +417,7 @@
             </w:tabs>
             <w:rPr/>
           </w:pPr>
-          <w:hyperlink w:anchor="__RefHeading___Toc1178_50781890">
+          <w:hyperlink w:anchor="__RefHeading___Toc1188_784777474">
             <w:r>
               <w:rPr>
                 <w:rStyle w:val="IndexLink"/>
@@ -437,7 +437,7 @@
             </w:tabs>
             <w:rPr/>
           </w:pPr>
-          <w:hyperlink w:anchor="__RefHeading___Toc1180_50781890">
+          <w:hyperlink w:anchor="__RefHeading___Toc1190_784777474">
             <w:r>
               <w:rPr>
                 <w:rStyle w:val="IndexLink"/>
@@ -457,7 +457,7 @@
             </w:tabs>
             <w:rPr/>
           </w:pPr>
-          <w:hyperlink w:anchor="__RefHeading___Toc1182_50781890">
+          <w:hyperlink w:anchor="__RefHeading___Toc1192_784777474">
             <w:r>
               <w:rPr>
                 <w:rStyle w:val="IndexLink"/>
@@ -477,7 +477,7 @@
             </w:tabs>
             <w:rPr/>
           </w:pPr>
-          <w:hyperlink w:anchor="__RefHeading___Toc1184_50781890">
+          <w:hyperlink w:anchor="__RefHeading___Toc1194_784777474">
             <w:r>
               <w:rPr>
                 <w:rStyle w:val="IndexLink"/>
@@ -497,7 +497,7 @@
             </w:tabs>
             <w:rPr/>
           </w:pPr>
-          <w:hyperlink w:anchor="__RefHeading___Toc1186_50781890">
+          <w:hyperlink w:anchor="__RefHeading___Toc1196_784777474">
             <w:r>
               <w:rPr>
                 <w:rStyle w:val="IndexLink"/>
@@ -517,7 +517,7 @@
             </w:tabs>
             <w:rPr/>
           </w:pPr>
-          <w:hyperlink w:anchor="__RefHeading___Toc1188_50781890">
+          <w:hyperlink w:anchor="__RefHeading___Toc1198_784777474">
             <w:r>
               <w:rPr>
                 <w:rStyle w:val="IndexLink"/>
@@ -537,7 +537,7 @@
             </w:tabs>
             <w:rPr/>
           </w:pPr>
-          <w:hyperlink w:anchor="__RefHeading___Toc1190_50781890">
+          <w:hyperlink w:anchor="__RefHeading___Toc1200_784777474">
             <w:r>
               <w:rPr>
                 <w:rStyle w:val="IndexLink"/>
@@ -557,7 +557,7 @@
             </w:tabs>
             <w:rPr/>
           </w:pPr>
-          <w:hyperlink w:anchor="__RefHeading___Toc1192_50781890">
+          <w:hyperlink w:anchor="__RefHeading___Toc1202_784777474">
             <w:r>
               <w:rPr>
                 <w:rStyle w:val="IndexLink"/>
@@ -577,7 +577,7 @@
             </w:tabs>
             <w:rPr/>
           </w:pPr>
-          <w:hyperlink w:anchor="__RefHeading___Toc1194_50781890">
+          <w:hyperlink w:anchor="__RefHeading___Toc1204_784777474">
             <w:r>
               <w:rPr>
                 <w:rStyle w:val="IndexLink"/>
@@ -597,7 +597,7 @@
             </w:tabs>
             <w:rPr/>
           </w:pPr>
-          <w:hyperlink w:anchor="__RefHeading___Toc1196_50781890">
+          <w:hyperlink w:anchor="__RefHeading___Toc1206_784777474">
             <w:r>
               <w:rPr>
                 <w:rStyle w:val="IndexLink"/>
@@ -617,7 +617,7 @@
             </w:tabs>
             <w:rPr/>
           </w:pPr>
-          <w:hyperlink w:anchor="__RefHeading___Toc1198_50781890">
+          <w:hyperlink w:anchor="__RefHeading___Toc1208_784777474">
             <w:r>
               <w:rPr>
                 <w:rStyle w:val="IndexLink"/>
@@ -637,7 +637,7 @@
             </w:tabs>
             <w:rPr/>
           </w:pPr>
-          <w:hyperlink w:anchor="__RefHeading___Toc1200_50781890">
+          <w:hyperlink w:anchor="__RefHeading___Toc1210_784777474">
             <w:r>
               <w:rPr>
                 <w:rStyle w:val="IndexLink"/>
@@ -657,7 +657,7 @@
             </w:tabs>
             <w:rPr/>
           </w:pPr>
-          <w:hyperlink w:anchor="__RefHeading___Toc1202_50781890">
+          <w:hyperlink w:anchor="__RefHeading___Toc1212_784777474">
             <w:r>
               <w:rPr>
                 <w:rStyle w:val="IndexLink"/>
@@ -677,7 +677,7 @@
             </w:tabs>
             <w:rPr/>
           </w:pPr>
-          <w:hyperlink w:anchor="__RefHeading___Toc1204_50781890">
+          <w:hyperlink w:anchor="__RefHeading___Toc1214_784777474">
             <w:r>
               <w:rPr>
                 <w:rStyle w:val="IndexLink"/>
@@ -697,7 +697,7 @@
             </w:tabs>
             <w:rPr/>
           </w:pPr>
-          <w:hyperlink w:anchor="__RefHeading___Toc1206_50781890">
+          <w:hyperlink w:anchor="__RefHeading___Toc1216_784777474">
             <w:r>
               <w:rPr>
                 <w:rStyle w:val="IndexLink"/>
@@ -717,7 +717,7 @@
             </w:tabs>
             <w:rPr/>
           </w:pPr>
-          <w:hyperlink w:anchor="__RefHeading___Toc1208_50781890">
+          <w:hyperlink w:anchor="__RefHeading___Toc1218_784777474">
             <w:r>
               <w:rPr>
                 <w:rStyle w:val="IndexLink"/>
@@ -737,7 +737,7 @@
             </w:tabs>
             <w:rPr/>
           </w:pPr>
-          <w:hyperlink w:anchor="__RefHeading___Toc1210_50781890">
+          <w:hyperlink w:anchor="__RefHeading___Toc1220_784777474">
             <w:r>
               <w:rPr>
                 <w:rStyle w:val="IndexLink"/>
@@ -757,7 +757,7 @@
             </w:tabs>
             <w:rPr/>
           </w:pPr>
-          <w:hyperlink w:anchor="__RefHeading___Toc1212_50781890">
+          <w:hyperlink w:anchor="__RefHeading___Toc1222_784777474">
             <w:r>
               <w:rPr>
                 <w:rStyle w:val="IndexLink"/>
@@ -777,7 +777,7 @@
             </w:tabs>
             <w:rPr/>
           </w:pPr>
-          <w:hyperlink w:anchor="__RefHeading___Toc1214_50781890">
+          <w:hyperlink w:anchor="__RefHeading___Toc1224_784777474">
             <w:r>
               <w:rPr>
                 <w:rStyle w:val="IndexLink"/>
@@ -797,7 +797,7 @@
             </w:tabs>
             <w:rPr/>
           </w:pPr>
-          <w:hyperlink w:anchor="__RefHeading___Toc1216_50781890">
+          <w:hyperlink w:anchor="__RefHeading___Toc1226_784777474">
             <w:r>
               <w:rPr>
                 <w:rStyle w:val="IndexLink"/>
@@ -817,7 +817,7 @@
             </w:tabs>
             <w:rPr/>
           </w:pPr>
-          <w:hyperlink w:anchor="__RefHeading___Toc1218_50781890">
+          <w:hyperlink w:anchor="__RefHeading___Toc1228_784777474">
             <w:r>
               <w:rPr>
                 <w:rStyle w:val="IndexLink"/>
@@ -837,7 +837,7 @@
             </w:tabs>
             <w:rPr/>
           </w:pPr>
-          <w:hyperlink w:anchor="__RefHeading___Toc1220_50781890">
+          <w:hyperlink w:anchor="__RefHeading___Toc1230_784777474">
             <w:r>
               <w:rPr>
                 <w:rStyle w:val="IndexLink"/>
@@ -857,7 +857,7 @@
             </w:tabs>
             <w:rPr/>
           </w:pPr>
-          <w:hyperlink w:anchor="__RefHeading___Toc1222_50781890">
+          <w:hyperlink w:anchor="__RefHeading___Toc1232_784777474">
             <w:r>
               <w:rPr>
                 <w:rStyle w:val="IndexLink"/>
@@ -877,7 +877,7 @@
             </w:tabs>
             <w:rPr/>
           </w:pPr>
-          <w:hyperlink w:anchor="__RefHeading___Toc1224_50781890">
+          <w:hyperlink w:anchor="__RefHeading___Toc1234_784777474">
             <w:r>
               <w:rPr>
                 <w:rStyle w:val="IndexLink"/>
@@ -897,7 +897,7 @@
             </w:tabs>
             <w:rPr/>
           </w:pPr>
-          <w:hyperlink w:anchor="__RefHeading___Toc1226_50781890">
+          <w:hyperlink w:anchor="__RefHeading___Toc1236_784777474">
             <w:r>
               <w:rPr>
                 <w:rStyle w:val="IndexLink"/>
@@ -917,7 +917,7 @@
             </w:tabs>
             <w:rPr/>
           </w:pPr>
-          <w:hyperlink w:anchor="__RefHeading___Toc1228_50781890">
+          <w:hyperlink w:anchor="__RefHeading___Toc1238_784777474">
             <w:r>
               <w:rPr>
                 <w:rStyle w:val="IndexLink"/>
@@ -937,7 +937,7 @@
             </w:tabs>
             <w:rPr/>
           </w:pPr>
-          <w:hyperlink w:anchor="__RefHeading___Toc1230_50781890">
+          <w:hyperlink w:anchor="__RefHeading___Toc1240_784777474">
             <w:r>
               <w:rPr>
                 <w:rStyle w:val="IndexLink"/>
@@ -957,7 +957,7 @@
             </w:tabs>
             <w:rPr/>
           </w:pPr>
-          <w:hyperlink w:anchor="__RefHeading___Toc1232_50781890">
+          <w:hyperlink w:anchor="__RefHeading___Toc1242_784777474">
             <w:r>
               <w:rPr>
                 <w:rStyle w:val="IndexLink"/>
@@ -977,7 +977,7 @@
             </w:tabs>
             <w:rPr/>
           </w:pPr>
-          <w:hyperlink w:anchor="__RefHeading___Toc1234_50781890">
+          <w:hyperlink w:anchor="__RefHeading___Toc1244_784777474">
             <w:r>
               <w:rPr>
                 <w:rStyle w:val="IndexLink"/>
@@ -1023,7 +1023,7 @@
         <w:spacing w:before="0" w:after="160"/>
         <w:rPr/>
       </w:pPr>
-      <w:bookmarkStart w:id="0" w:name="__RefHeading___Toc1150_50781890"/>
+      <w:bookmarkStart w:id="0" w:name="__RefHeading___Toc1160_784777474"/>
       <w:bookmarkEnd w:id="0"/>
       <w:r>
         <w:rPr/>
@@ -1090,7 +1090,7 @@
         <w:keepNext w:val="true"/>
         <w:rPr/>
       </w:pPr>
-      <w:bookmarkStart w:id="1" w:name="__RefHeading___Toc1152_50781890"/>
+      <w:bookmarkStart w:id="1" w:name="__RefHeading___Toc1162_784777474"/>
       <w:bookmarkEnd w:id="1"/>
       <w:r>
         <w:rPr/>
@@ -1213,7 +1213,7 @@
         <w:keepNext w:val="true"/>
         <w:rPr/>
       </w:pPr>
-      <w:bookmarkStart w:id="2" w:name="__RefHeading___Toc1154_50781890"/>
+      <w:bookmarkStart w:id="2" w:name="__RefHeading___Toc1164_784777474"/>
       <w:bookmarkEnd w:id="2"/>
       <w:r>
         <w:rPr/>
@@ -1574,7 +1574,7 @@
         <w:pStyle w:val="Heading1"/>
         <w:rPr/>
       </w:pPr>
-      <w:bookmarkStart w:id="3" w:name="__RefHeading___Toc1156_50781890"/>
+      <w:bookmarkStart w:id="3" w:name="__RefHeading___Toc1166_784777474"/>
       <w:bookmarkEnd w:id="3"/>
       <w:r>
         <w:rPr/>
@@ -1587,7 +1587,7 @@
         <w:keepNext w:val="true"/>
         <w:rPr/>
       </w:pPr>
-      <w:bookmarkStart w:id="4" w:name="__RefHeading___Toc1158_50781890"/>
+      <w:bookmarkStart w:id="4" w:name="__RefHeading___Toc1168_784777474"/>
       <w:bookmarkEnd w:id="4"/>
       <w:r>
         <w:rPr/>
@@ -1703,7 +1703,7 @@
         <w:keepNext w:val="true"/>
         <w:rPr/>
       </w:pPr>
-      <w:bookmarkStart w:id="5" w:name="__RefHeading___Toc1160_50781890"/>
+      <w:bookmarkStart w:id="5" w:name="__RefHeading___Toc1170_784777474"/>
       <w:bookmarkEnd w:id="5"/>
       <w:r>
         <w:rPr/>
@@ -2084,7 +2084,7 @@
         <w:keepNext w:val="true"/>
         <w:rPr/>
       </w:pPr>
-      <w:bookmarkStart w:id="6" w:name="__RefHeading___Toc1162_50781890"/>
+      <w:bookmarkStart w:id="6" w:name="__RefHeading___Toc1172_784777474"/>
       <w:bookmarkEnd w:id="6"/>
       <w:r>
         <w:rPr/>
@@ -2434,7 +2434,7 @@
         <w:keepNext w:val="true"/>
         <w:rPr/>
       </w:pPr>
-      <w:bookmarkStart w:id="7" w:name="__RefHeading___Toc1164_50781890"/>
+      <w:bookmarkStart w:id="7" w:name="__RefHeading___Toc1174_784777474"/>
       <w:bookmarkEnd w:id="7"/>
       <w:r>
         <w:rPr/>
@@ -2624,7 +2624,7 @@
         <w:keepNext w:val="true"/>
         <w:rPr/>
       </w:pPr>
-      <w:bookmarkStart w:id="8" w:name="__RefHeading___Toc1166_50781890"/>
+      <w:bookmarkStart w:id="8" w:name="__RefHeading___Toc1176_784777474"/>
       <w:bookmarkEnd w:id="8"/>
       <w:r>
         <w:rPr/>
@@ -2650,7 +2650,7 @@
         <w:pStyle w:val="Heading1"/>
         <w:rPr/>
       </w:pPr>
-      <w:bookmarkStart w:id="9" w:name="__RefHeading___Toc1168_50781890"/>
+      <w:bookmarkStart w:id="9" w:name="__RefHeading___Toc1178_784777474"/>
       <w:bookmarkEnd w:id="9"/>
       <w:r>
         <w:rPr/>
@@ -3428,7 +3428,7 @@
         <w:pStyle w:val="Heading1"/>
         <w:rPr/>
       </w:pPr>
-      <w:bookmarkStart w:id="10" w:name="__RefHeading___Toc1170_50781890"/>
+      <w:bookmarkStart w:id="10" w:name="__RefHeading___Toc1180_784777474"/>
       <w:bookmarkEnd w:id="10"/>
       <w:r>
         <w:rPr/>
@@ -3441,7 +3441,7 @@
         <w:keepNext w:val="true"/>
         <w:rPr/>
       </w:pPr>
-      <w:bookmarkStart w:id="11" w:name="__RefHeading___Toc1172_50781890"/>
+      <w:bookmarkStart w:id="11" w:name="__RefHeading___Toc1182_784777474"/>
       <w:bookmarkEnd w:id="11"/>
       <w:r>
         <w:rPr/>
@@ -3502,7 +3502,7 @@
         <w:keepNext w:val="true"/>
         <w:rPr/>
       </w:pPr>
-      <w:bookmarkStart w:id="12" w:name="__RefHeading___Toc1174_50781890"/>
+      <w:bookmarkStart w:id="12" w:name="__RefHeading___Toc1184_784777474"/>
       <w:bookmarkEnd w:id="12"/>
       <w:r>
         <w:rPr/>
@@ -3594,7 +3594,7 @@
         <w:keepNext w:val="true"/>
         <w:rPr/>
       </w:pPr>
-      <w:bookmarkStart w:id="13" w:name="__RefHeading___Toc1176_50781890"/>
+      <w:bookmarkStart w:id="13" w:name="__RefHeading___Toc1186_784777474"/>
       <w:bookmarkEnd w:id="13"/>
       <w:r>
         <w:rPr/>
@@ -3631,7 +3631,7 @@
         <w:pStyle w:val="Heading1"/>
         <w:rPr/>
       </w:pPr>
-      <w:bookmarkStart w:id="14" w:name="__RefHeading___Toc1178_50781890"/>
+      <w:bookmarkStart w:id="14" w:name="__RefHeading___Toc1188_784777474"/>
       <w:bookmarkEnd w:id="14"/>
       <w:r>
         <w:rPr/>
@@ -3794,7 +3794,7 @@
         <w:pStyle w:val="Heading1"/>
         <w:rPr/>
       </w:pPr>
-      <w:bookmarkStart w:id="15" w:name="__RefHeading___Toc1180_50781890"/>
+      <w:bookmarkStart w:id="15" w:name="__RefHeading___Toc1190_784777474"/>
       <w:bookmarkEnd w:id="15"/>
       <w:r>
         <w:rPr/>
@@ -3977,7 +3977,7 @@
         <w:pStyle w:val="Heading1"/>
         <w:rPr/>
       </w:pPr>
-      <w:bookmarkStart w:id="16" w:name="__RefHeading___Toc1182_50781890"/>
+      <w:bookmarkStart w:id="16" w:name="__RefHeading___Toc1192_784777474"/>
       <w:bookmarkEnd w:id="16"/>
       <w:r>
         <w:rPr/>
@@ -4042,7 +4042,7 @@
         <w:pStyle w:val="Heading1"/>
         <w:rPr/>
       </w:pPr>
-      <w:bookmarkStart w:id="17" w:name="__RefHeading___Toc1184_50781890"/>
+      <w:bookmarkStart w:id="17" w:name="__RefHeading___Toc1194_784777474"/>
       <w:bookmarkEnd w:id="17"/>
       <w:r>
         <w:rPr/>
@@ -4066,7 +4066,7 @@
         <w:keepNext w:val="true"/>
         <w:rPr/>
       </w:pPr>
-      <w:bookmarkStart w:id="18" w:name="__RefHeading___Toc1186_50781890"/>
+      <w:bookmarkStart w:id="18" w:name="__RefHeading___Toc1196_784777474"/>
       <w:bookmarkEnd w:id="18"/>
       <w:r>
         <w:rPr/>
@@ -4090,7 +4090,7 @@
         <w:keepNext w:val="true"/>
         <w:rPr/>
       </w:pPr>
-      <w:bookmarkStart w:id="19" w:name="__RefHeading___Toc1188_50781890"/>
+      <w:bookmarkStart w:id="19" w:name="__RefHeading___Toc1198_784777474"/>
       <w:bookmarkEnd w:id="19"/>
       <w:r>
         <w:rPr/>
@@ -4322,7 +4322,7 @@
         <w:keepNext w:val="true"/>
         <w:rPr/>
       </w:pPr>
-      <w:bookmarkStart w:id="20" w:name="__RefHeading___Toc1190_50781890"/>
+      <w:bookmarkStart w:id="20" w:name="__RefHeading___Toc1200_784777474"/>
       <w:bookmarkEnd w:id="20"/>
       <w:r>
         <w:rPr/>
@@ -4385,7 +4385,7 @@
         <w:keepNext w:val="true"/>
         <w:rPr/>
       </w:pPr>
-      <w:bookmarkStart w:id="21" w:name="__RefHeading___Toc1192_50781890"/>
+      <w:bookmarkStart w:id="21" w:name="__RefHeading___Toc1202_784777474"/>
       <w:bookmarkEnd w:id="21"/>
       <w:r>
         <w:rPr/>
@@ -4789,7 +4789,7 @@
         <w:keepNext w:val="true"/>
         <w:rPr/>
       </w:pPr>
-      <w:bookmarkStart w:id="22" w:name="__RefHeading___Toc1194_50781890"/>
+      <w:bookmarkStart w:id="22" w:name="__RefHeading___Toc1204_784777474"/>
       <w:bookmarkEnd w:id="22"/>
       <w:r>
         <w:rPr/>
@@ -4812,7 +4812,7 @@
         <w:pStyle w:val="Heading1"/>
         <w:rPr/>
       </w:pPr>
-      <w:bookmarkStart w:id="23" w:name="__RefHeading___Toc1196_50781890"/>
+      <w:bookmarkStart w:id="23" w:name="__RefHeading___Toc1206_784777474"/>
       <w:bookmarkEnd w:id="23"/>
       <w:r>
         <w:rPr/>
@@ -4934,7 +4934,7 @@
         <w:pStyle w:val="Heading1"/>
         <w:rPr/>
       </w:pPr>
-      <w:bookmarkStart w:id="24" w:name="__RefHeading___Toc1198_50781890"/>
+      <w:bookmarkStart w:id="24" w:name="__RefHeading___Toc1208_784777474"/>
       <w:bookmarkEnd w:id="24"/>
       <w:r>
         <w:rPr/>
@@ -5343,7 +5343,7 @@
         <w:keepNext w:val="true"/>
         <w:rPr/>
       </w:pPr>
-      <w:bookmarkStart w:id="25" w:name="__RefHeading___Toc1200_50781890"/>
+      <w:bookmarkStart w:id="25" w:name="__RefHeading___Toc1210_784777474"/>
       <w:bookmarkEnd w:id="25"/>
       <w:r>
         <w:rPr/>
@@ -5417,7 +5417,7 @@
         <w:pStyle w:val="Heading1"/>
         <w:rPr/>
       </w:pPr>
-      <w:bookmarkStart w:id="26" w:name="__RefHeading___Toc1202_50781890"/>
+      <w:bookmarkStart w:id="26" w:name="__RefHeading___Toc1212_784777474"/>
       <w:bookmarkEnd w:id="26"/>
       <w:r>
         <w:rPr/>
@@ -6117,7 +6117,7 @@
         <w:keepNext w:val="true"/>
         <w:rPr/>
       </w:pPr>
-      <w:bookmarkStart w:id="27" w:name="__RefHeading___Toc1204_50781890"/>
+      <w:bookmarkStart w:id="27" w:name="__RefHeading___Toc1214_784777474"/>
       <w:bookmarkEnd w:id="27"/>
       <w:r>
         <w:rPr/>
@@ -6353,7 +6353,7 @@
         <w:pStyle w:val="Heading1"/>
         <w:rPr/>
       </w:pPr>
-      <w:bookmarkStart w:id="28" w:name="__RefHeading___Toc1206_50781890"/>
+      <w:bookmarkStart w:id="28" w:name="__RefHeading___Toc1216_784777474"/>
       <w:bookmarkEnd w:id="28"/>
       <w:r>
         <w:rPr/>
@@ -7889,7 +7889,7 @@
         <w:pStyle w:val="Heading1"/>
         <w:rPr/>
       </w:pPr>
-      <w:bookmarkStart w:id="29" w:name="__RefHeading___Toc1208_50781890"/>
+      <w:bookmarkStart w:id="29" w:name="__RefHeading___Toc1218_784777474"/>
       <w:bookmarkEnd w:id="29"/>
       <w:r>
         <w:rPr/>
@@ -8310,7 +8310,7 @@
         <w:pStyle w:val="Heading1"/>
         <w:rPr/>
       </w:pPr>
-      <w:bookmarkStart w:id="30" w:name="__RefHeading___Toc1210_50781890"/>
+      <w:bookmarkStart w:id="30" w:name="__RefHeading___Toc1220_784777474"/>
       <w:bookmarkEnd w:id="30"/>
       <w:r>
         <w:rPr/>
@@ -8323,7 +8323,7 @@
         <w:keepNext w:val="true"/>
         <w:rPr/>
       </w:pPr>
-      <w:bookmarkStart w:id="31" w:name="__RefHeading___Toc1212_50781890"/>
+      <w:bookmarkStart w:id="31" w:name="__RefHeading___Toc1222_784777474"/>
       <w:bookmarkEnd w:id="31"/>
       <w:r>
         <w:rPr/>
@@ -9266,7 +9266,7 @@
         <w:keepNext w:val="true"/>
         <w:rPr/>
       </w:pPr>
-      <w:bookmarkStart w:id="32" w:name="__RefHeading___Toc1214_50781890"/>
+      <w:bookmarkStart w:id="32" w:name="__RefHeading___Toc1224_784777474"/>
       <w:bookmarkEnd w:id="32"/>
       <w:r>
         <w:rPr/>
@@ -9726,7 +9726,7 @@
         <w:keepNext w:val="true"/>
         <w:rPr/>
       </w:pPr>
-      <w:bookmarkStart w:id="33" w:name="__RefHeading___Toc1216_50781890"/>
+      <w:bookmarkStart w:id="33" w:name="__RefHeading___Toc1226_784777474"/>
       <w:bookmarkEnd w:id="33"/>
       <w:r>
         <w:rPr/>
@@ -9864,7 +9864,7 @@
         <w:pStyle w:val="Heading1"/>
         <w:rPr/>
       </w:pPr>
-      <w:bookmarkStart w:id="34" w:name="__RefHeading___Toc1218_50781890"/>
+      <w:bookmarkStart w:id="34" w:name="__RefHeading___Toc1228_784777474"/>
       <w:bookmarkEnd w:id="34"/>
       <w:r>
         <w:rPr/>
@@ -10018,7 +10018,7 @@
             </w:pPr>
             <w:r>
               <w:rPr/>
-              <w:t>Absturzrisiko als breites, halbtransparentes Band unter der Weglinie: Klasse 1 ohne Band, 2 hellorange, 3 orange, 4 rot.</w:t>
+              <w:t>Absturzrisiko als breites, halbtransparentes Band unter der Weglinie: Klasse 1 ohne Band, 2 hellorange, 3 rot, 4 magenta.</w:t>
             </w:r>
           </w:p>
         </w:tc>
@@ -10187,7 +10187,85 @@
             </w:pPr>
             <w:r>
               <w:rPr/>
-              <w:t>Schwierigkeit nach Schweizer Signalisation: T1 gelb, T2/T3 rot, T4/T5 blau, T6 magenta, ab T2 mit weissem Rand, T-Beschriftung mit weissem Hintergrund.</w:t>
+              <w:t xml:space="preserve">OSM </w:t>
+            </w:r>
+            <w:r>
+              <w:rPr>
+                <w:rFonts w:eastAsia="Consolas" w:cs="Consolas" w:ascii="Consolas" w:hAnsi="Consolas"/>
+                <w:color w:val="333333"/>
+                <w:sz w:val="20"/>
+                <w:szCs w:val="20"/>
+              </w:rPr>
+              <w:t>sac_scale</w:t>
+            </w:r>
+            <w:r>
+              <w:rPr/>
+              <w:t xml:space="preserve"> nach Schweizer Signalisation: T1 gelb, T2/T3 rot, T4/T5 blau, T6 magenta, ab T2 mit weissem Rand, T-Beschriftung mit weissem Hintergrund.</w:t>
+            </w:r>
+          </w:p>
+        </w:tc>
+      </w:tr>
+      <w:tr>
+        <w:trPr/>
+        <w:tc>
+          <w:tcPr>
+            <w:tcW w:w="3799" w:type="dxa"/>
+            <w:tcBorders>
+              <w:top w:val="single" w:sz="4" w:space="0" w:color="BFBFBF"/>
+              <w:left w:val="single" w:sz="4" w:space="0" w:color="BFBFBF"/>
+              <w:bottom w:val="single" w:sz="4" w:space="0" w:color="BFBFBF"/>
+              <w:right w:val="single" w:sz="4" w:space="0" w:color="BFBFBF"/>
+            </w:tcBorders>
+          </w:tcPr>
+          <w:p>
+            <w:pPr>
+              <w:pStyle w:val="Normal"/>
+              <w:spacing w:before="0" w:after="0"/>
+              <w:rPr/>
+            </w:pPr>
+            <w:r>
+              <w:rPr>
+                <w:rFonts w:eastAsia="Consolas" w:cs="Consolas" w:ascii="Consolas" w:hAnsi="Consolas"/>
+                <w:color w:val="333333"/>
+                <w:sz w:val="20"/>
+                <w:szCs w:val="20"/>
+              </w:rPr>
+              <w:t>swisstlm3d_wanderwege_signalisation.qml</w:t>
+            </w:r>
+          </w:p>
+        </w:tc>
+        <w:tc>
+          <w:tcPr>
+            <w:tcW w:w="5226" w:type="dxa"/>
+            <w:tcBorders>
+              <w:top w:val="single" w:sz="4" w:space="0" w:color="BFBFBF"/>
+              <w:left w:val="single" w:sz="4" w:space="0" w:color="BFBFBF"/>
+              <w:bottom w:val="single" w:sz="4" w:space="0" w:color="BFBFBF"/>
+              <w:right w:val="single" w:sz="4" w:space="0" w:color="BFBFBF"/>
+            </w:tcBorders>
+          </w:tcPr>
+          <w:p>
+            <w:pPr>
+              <w:pStyle w:val="Normal"/>
+              <w:spacing w:before="0" w:after="0"/>
+              <w:rPr/>
+            </w:pPr>
+            <w:r>
+              <w:rPr/>
+              <w:t xml:space="preserve">swissTLM3D-Wanderwege (Feld </w:t>
+            </w:r>
+            <w:r>
+              <w:rPr>
+                <w:rFonts w:eastAsia="Consolas" w:cs="Consolas" w:ascii="Consolas" w:hAnsi="Consolas"/>
+                <w:color w:val="333333"/>
+                <w:sz w:val="20"/>
+                <w:szCs w:val="20"/>
+              </w:rPr>
+              <w:t>wanderwege</w:t>
+            </w:r>
+            <w:r>
+              <w:rPr/>
+              <w:t>): Wanderweg gelb, Bergwanderweg rot, Alpinwanderweg blau, die beiden letzten mit weissem Rand. Statt einer Beschriftung stehen die Wegzeichen auf der Linie: gelbe Raute, weiss-rot-weisses und weiss-blau-weisses Fähnchen.</w:t>
             </w:r>
           </w:p>
         </w:tc>
@@ -10209,7 +10287,7 @@
         <w:keepNext w:val="true"/>
         <w:rPr/>
       </w:pPr>
-      <w:bookmarkStart w:id="35" w:name="__RefHeading___Toc1220_50781890"/>
+      <w:bookmarkStart w:id="35" w:name="__RefHeading___Toc1230_784777474"/>
       <w:bookmarkEnd w:id="35"/>
       <w:r>
         <w:rPr/>
@@ -10259,7 +10337,7 @@
       </w:r>
       <w:r>
         <w:rPr/>
-        <w:t xml:space="preserve"> dem </w:t>
+        <w:t xml:space="preserve"> dem Weg-Layer (</w:t>
       </w:r>
       <w:r>
         <w:rPr>
@@ -10272,7 +10350,7 @@
       </w:r>
       <w:r>
         <w:rPr/>
-        <w:t>-Layer. Die Weglinie zeigt dann die Schwierigkeit, das Band darum die Absturzfolgen. Der weisse Rand trennt beides, sodass auch eine rote T2-Linie auf rotem Band lesbar bleibt.</w:t>
+        <w:t xml:space="preserve"> oder swissTLM3D). Die Weglinie zeigt dann die Schwierigkeit, das Band darum die Absturzfolgen. Der weisse Rand trennt beides, sodass auch eine rote T2-Linie auf rotem Band lesbar bleibt.</w:t>
       </w:r>
     </w:p>
     <w:p>
@@ -10283,7 +10361,7 @@
       </w:pPr>
       <w:r>
         <w:rPr/>
-        <w:t>Für „mässig“ ist bewusst Hellorange statt Gelb gewählt, sonst verschwindet ein gelber T1-Weg im Band. Warngelb für „sehr hoch“ wurde verworfen, weil es heller wirkt als „hoch“.</w:t>
+        <w:t>Für „mässig“ ist bewusst Hellorange statt Gelb gewählt, sonst verschwindet ein gelber T1-Weg im Band. Für „sehr hoch“ ist Magenta gewählt: Orange und Rot waren auf dem Smartphone kaum zu unterscheiden, Magenta sticht dagegen auch klein heraus und entspricht der pinken Markierung der DIGIWAY Exposure Map.</w:t>
       </w:r>
     </w:p>
     <w:p>
@@ -10334,7 +10412,7 @@
         <w:pStyle w:val="Heading1"/>
         <w:rPr/>
       </w:pPr>
-      <w:bookmarkStart w:id="36" w:name="__RefHeading___Toc1222_50781890"/>
+      <w:bookmarkStart w:id="36" w:name="__RefHeading___Toc1232_784777474"/>
       <w:bookmarkEnd w:id="36"/>
       <w:r>
         <w:rPr/>
@@ -10358,7 +10436,7 @@
         <w:keepNext w:val="true"/>
         <w:rPr/>
       </w:pPr>
-      <w:bookmarkStart w:id="37" w:name="__RefHeading___Toc1224_50781890"/>
+      <w:bookmarkStart w:id="37" w:name="__RefHeading___Toc1234_784777474"/>
       <w:bookmarkEnd w:id="37"/>
       <w:r>
         <w:rPr/>
@@ -10842,7 +10920,7 @@
         <w:keepNext w:val="true"/>
         <w:rPr/>
       </w:pPr>
-      <w:bookmarkStart w:id="38" w:name="__RefHeading___Toc1226_50781890"/>
+      <w:bookmarkStart w:id="38" w:name="__RefHeading___Toc1236_784777474"/>
       <w:bookmarkEnd w:id="38"/>
       <w:r>
         <w:rPr/>
@@ -10866,7 +10944,7 @@
         <w:keepNext w:val="true"/>
         <w:rPr/>
       </w:pPr>
-      <w:bookmarkStart w:id="39" w:name="__RefHeading___Toc1228_50781890"/>
+      <w:bookmarkStart w:id="39" w:name="__RefHeading___Toc1238_784777474"/>
       <w:bookmarkEnd w:id="39"/>
       <w:r>
         <w:rPr/>
@@ -10892,7 +10970,7 @@
         <w:pStyle w:val="Heading1"/>
         <w:rPr/>
       </w:pPr>
-      <w:bookmarkStart w:id="40" w:name="__RefHeading___Toc1230_50781890"/>
+      <w:bookmarkStart w:id="40" w:name="__RefHeading___Toc1240_784777474"/>
       <w:bookmarkEnd w:id="40"/>
       <w:r>
         <w:rPr/>
@@ -11043,7 +11121,7 @@
         <w:pStyle w:val="Heading1"/>
         <w:rPr/>
       </w:pPr>
-      <w:bookmarkStart w:id="41" w:name="__RefHeading___Toc1232_50781890"/>
+      <w:bookmarkStart w:id="41" w:name="__RefHeading___Toc1242_784777474"/>
       <w:bookmarkEnd w:id="41"/>
       <w:r>
         <w:rPr/>
@@ -11277,7 +11355,7 @@
         <w:keepNext w:val="true"/>
         <w:rPr/>
       </w:pPr>
-      <w:bookmarkStart w:id="42" w:name="__RefHeading___Toc1234_50781890"/>
+      <w:bookmarkStart w:id="42" w:name="__RefHeading___Toc1244_784777474"/>
       <w:bookmarkEnd w:id="42"/>
       <w:r>
         <w:rPr/>

</xml_diff>